<commit_message>
Update IR exemption declaration: follow model format and correct legal references
- Reformatted to match the standard model template (single declaration paragraph)
- Updated IN RFB nº 1548/2015 to IN RFB nº 2172, de 9 de janeiro de 2024
- Added footnote noting the revocation of IN 1548 and end of DAI since 2008
- Included full text of Lei nº 7.115/83 as in the model

Co-Authored-By: Claude Opus 4.6 <noreply@anthropic.com>
Claude-Session: https://claude.ai/code/session_017AwowK1WNMoXShPKi68xcJ
</commit_message>
<xml_diff>
--- a/Declaracao_Isencao_IR_Vinicius_Santana.docx
+++ b/Declaracao_Isencao_IR_Vinicius_Santana.docx
@@ -4,7 +4,7 @@
   <w:body>
     <w:p>
       <w:pPr>
-        <w:spacing w:after="400"/>
+        <w:spacing w:after="600"/>
         <w:jc w:val="center"/>
       </w:pPr>
       <w:r>
@@ -15,17 +15,17 @@
           <w:sz w:val="28"/>
           <w:szCs w:val="28"/>
         </w:rPr>
-        <w:t xml:space="preserve">DECLARAÇÃO DE ISENÇÃO DE IMPOSTO DE RENDA</w:t>
-      </w:r>
-    </w:p>
-    <w:p>
-      <w:pPr>
-        <w:spacing w:after="400"/>
-      </w:pPr>
-    </w:p>
-    <w:p>
-      <w:pPr>
-        <w:spacing w:after="300" w:line="360"/>
+        <w:t xml:space="preserve">Declaração de Isenção do Imposto de Renda Pessoa Física (IRPF)</w:t>
+      </w:r>
+    </w:p>
+    <w:p>
+      <w:pPr>
+        <w:spacing w:after="200"/>
+      </w:pPr>
+    </w:p>
+    <w:p>
+      <w:pPr>
+        <w:spacing w:after="300" w:line="360" w:lineRule="auto"/>
         <w:ind w:firstLine="720"/>
         <w:jc w:val="both"/>
       </w:pPr>
@@ -53,7 +53,169 @@
           <w:sz w:val="24"/>
           <w:szCs w:val="24"/>
         </w:rPr>
-        <w:t xml:space="preserve">, brasileiro, solteiro, operador de loja, portador da cédula de identidade RG nº 39.642.708-X SSP/SP e inscrito no CPF sob nº 513.587.828-90, residente e domiciliado na Rua Manuel Alvarez, 700 — Jardim Vaz de Lima — São Paulo/SP, CEP: 05833-210, </w:t>
+        <w:t xml:space="preserve">, RG/CNH nº </w:t>
+      </w:r>
+      <w:r>
+        <w:rPr>
+          <w:rFonts w:ascii="Arial" w:cs="Arial" w:eastAsia="Arial" w:hAnsi="Arial"/>
+          <w:b/>
+          <w:bCs/>
+          <w:sz w:val="24"/>
+          <w:szCs w:val="24"/>
+        </w:rPr>
+        <w:t xml:space="preserve">39.642.708-X</w:t>
+      </w:r>
+      <w:r>
+        <w:rPr>
+          <w:rFonts w:ascii="Arial" w:cs="Arial" w:eastAsia="Arial" w:hAnsi="Arial"/>
+          <w:sz w:val="24"/>
+          <w:szCs w:val="24"/>
+        </w:rPr>
+        <w:t xml:space="preserve">, órgão expedidor: </w:t>
+      </w:r>
+      <w:r>
+        <w:rPr>
+          <w:rFonts w:ascii="Arial" w:cs="Arial" w:eastAsia="Arial" w:hAnsi="Arial"/>
+          <w:b/>
+          <w:bCs/>
+          <w:sz w:val="24"/>
+          <w:szCs w:val="24"/>
+        </w:rPr>
+        <w:t xml:space="preserve">SSP</w:t>
+      </w:r>
+      <w:r>
+        <w:rPr>
+          <w:rFonts w:ascii="Arial" w:cs="Arial" w:eastAsia="Arial" w:hAnsi="Arial"/>
+          <w:sz w:val="24"/>
+          <w:szCs w:val="24"/>
+        </w:rPr>
+        <w:t xml:space="preserve">, UF: </w:t>
+      </w:r>
+      <w:r>
+        <w:rPr>
+          <w:rFonts w:ascii="Arial" w:cs="Arial" w:eastAsia="Arial" w:hAnsi="Arial"/>
+          <w:b/>
+          <w:bCs/>
+          <w:sz w:val="24"/>
+          <w:szCs w:val="24"/>
+        </w:rPr>
+        <w:t xml:space="preserve">SP</w:t>
+      </w:r>
+      <w:r>
+        <w:rPr>
+          <w:rFonts w:ascii="Arial" w:cs="Arial" w:eastAsia="Arial" w:hAnsi="Arial"/>
+          <w:sz w:val="24"/>
+          <w:szCs w:val="24"/>
+        </w:rPr>
+        <w:t xml:space="preserve">, CPF </w:t>
+      </w:r>
+      <w:r>
+        <w:rPr>
+          <w:rFonts w:ascii="Arial" w:cs="Arial" w:eastAsia="Arial" w:hAnsi="Arial"/>
+          <w:b/>
+          <w:bCs/>
+          <w:sz w:val="24"/>
+          <w:szCs w:val="24"/>
+        </w:rPr>
+        <w:t xml:space="preserve">513.587.828-90</w:t>
+      </w:r>
+      <w:r>
+        <w:rPr>
+          <w:rFonts w:ascii="Arial" w:cs="Arial" w:eastAsia="Arial" w:hAnsi="Arial"/>
+          <w:sz w:val="24"/>
+          <w:szCs w:val="24"/>
+        </w:rPr>
+        <w:t xml:space="preserve">, endereço </w:t>
+      </w:r>
+      <w:r>
+        <w:rPr>
+          <w:rFonts w:ascii="Arial" w:cs="Arial" w:eastAsia="Arial" w:hAnsi="Arial"/>
+          <w:b/>
+          <w:bCs/>
+          <w:sz w:val="24"/>
+          <w:szCs w:val="24"/>
+        </w:rPr>
+        <w:t xml:space="preserve">Rua Manuel Alvarez, 700 — Jardim Vaz de Lima</w:t>
+      </w:r>
+      <w:r>
+        <w:rPr>
+          <w:rFonts w:ascii="Arial" w:cs="Arial" w:eastAsia="Arial" w:hAnsi="Arial"/>
+          <w:sz w:val="24"/>
+          <w:szCs w:val="24"/>
+        </w:rPr>
+        <w:t xml:space="preserve">, CEP </w:t>
+      </w:r>
+      <w:r>
+        <w:rPr>
+          <w:rFonts w:ascii="Arial" w:cs="Arial" w:eastAsia="Arial" w:hAnsi="Arial"/>
+          <w:b/>
+          <w:bCs/>
+          <w:sz w:val="24"/>
+          <w:szCs w:val="24"/>
+        </w:rPr>
+        <w:t xml:space="preserve">05833-210</w:t>
+      </w:r>
+      <w:r>
+        <w:rPr>
+          <w:rFonts w:ascii="Arial" w:cs="Arial" w:eastAsia="Arial" w:hAnsi="Arial"/>
+          <w:sz w:val="24"/>
+          <w:szCs w:val="24"/>
+        </w:rPr>
+        <w:t xml:space="preserve">, cidade de </w:t>
+      </w:r>
+      <w:r>
+        <w:rPr>
+          <w:rFonts w:ascii="Arial" w:cs="Arial" w:eastAsia="Arial" w:hAnsi="Arial"/>
+          <w:b/>
+          <w:bCs/>
+          <w:sz w:val="24"/>
+          <w:szCs w:val="24"/>
+        </w:rPr>
+        <w:t xml:space="preserve">São Paulo</w:t>
+      </w:r>
+      <w:r>
+        <w:rPr>
+          <w:rFonts w:ascii="Arial" w:cs="Arial" w:eastAsia="Arial" w:hAnsi="Arial"/>
+          <w:sz w:val="24"/>
+          <w:szCs w:val="24"/>
+        </w:rPr>
+        <w:t xml:space="preserve">, telefone(s) (</w:t>
+      </w:r>
+      <w:r>
+        <w:rPr>
+          <w:rFonts w:ascii="Arial" w:cs="Arial" w:eastAsia="Arial" w:hAnsi="Arial"/>
+          <w:b/>
+          <w:bCs/>
+          <w:sz w:val="24"/>
+          <w:szCs w:val="24"/>
+        </w:rPr>
+        <w:t xml:space="preserve">11</w:t>
+      </w:r>
+      <w:r>
+        <w:rPr>
+          <w:rFonts w:ascii="Arial" w:cs="Arial" w:eastAsia="Arial" w:hAnsi="Arial"/>
+          <w:sz w:val="24"/>
+          <w:szCs w:val="24"/>
+        </w:rPr>
+        <w:t xml:space="preserve">) </w:t>
+      </w:r>
+      <w:r>
+        <w:rPr>
+          <w:rFonts w:ascii="Arial" w:cs="Arial" w:eastAsia="Arial" w:hAnsi="Arial"/>
+          <w:b/>
+          <w:bCs/>
+          <w:sz w:val="24"/>
+          <w:szCs w:val="24"/>
+        </w:rPr>
+        <w:t xml:space="preserve">93009-0957</w:t>
+      </w:r>
+      <w:r>
+        <w:rPr>
+          <w:rFonts w:ascii="Arial" w:cs="Arial" w:eastAsia="Arial" w:hAnsi="Arial"/>
+          <w:sz w:val="24"/>
+          <w:szCs w:val="24"/>
+        </w:rPr>
+        <w:t xml:space="preserve">, </w:t>
       </w:r>
       <w:r>
         <w:rPr>
@@ -71,142 +233,55 @@
           <w:sz w:val="24"/>
           <w:szCs w:val="24"/>
         </w:rPr>
-        <w:t xml:space="preserve">, sob as penas da lei, para fins de comprovação junto ao Poder Judiciário do Estado de São Paulo, nos autos do Processo nº 4084053-29.2026.8.26.0002, em trâmite perante a 2ª Vara Cível do Foro Regional de Santo Amaro, que:</w:t>
-      </w:r>
-    </w:p>
-    <w:p>
-      <w:pPr>
-        <w:spacing w:after="200" w:line="360"/>
+        <w:t xml:space="preserve"> ser isento(a) da apresentação da Declaração do Imposto de Renda Pessoa Física (DIRPF) no(s) exercício(s) </w:t>
+      </w:r>
+      <w:r>
+        <w:rPr>
+          <w:rFonts w:ascii="Arial" w:cs="Arial" w:eastAsia="Arial" w:hAnsi="Arial"/>
+          <w:b/>
+          <w:bCs/>
+          <w:sz w:val="24"/>
+          <w:szCs w:val="24"/>
+        </w:rPr>
+        <w:t xml:space="preserve">2023-2024-2025</w:t>
+      </w:r>
+      <w:r>
+        <w:rPr>
+          <w:rFonts w:ascii="Arial" w:cs="Arial" w:eastAsia="Arial" w:hAnsi="Arial"/>
+          <w:sz w:val="24"/>
+          <w:szCs w:val="24"/>
+        </w:rPr>
+        <w:t xml:space="preserve"> por não incorrer em nenhuma das hipóteses de obrigatoriedade estabelecidas pelas Instruções Normativas (IN) da Receita Federal do Brasil (RFB).</w:t>
+      </w:r>
+    </w:p>
+    <w:p>
+      <w:pPr>
+        <w:spacing w:after="300" w:line="360" w:lineRule="auto"/>
         <w:ind w:firstLine="720"/>
         <w:jc w:val="both"/>
       </w:pPr>
       <w:r>
         <w:rPr>
           <w:rFonts w:ascii="Arial" w:cs="Arial" w:eastAsia="Arial" w:hAnsi="Arial"/>
-          <w:b/>
-          <w:bCs/>
-          <w:sz w:val="24"/>
-          <w:szCs w:val="24"/>
-        </w:rPr>
-        <w:t xml:space="preserve">I — </w:t>
-      </w:r>
-      <w:r>
-        <w:rPr>
-          <w:rFonts w:ascii="Arial" w:cs="Arial" w:eastAsia="Arial" w:hAnsi="Arial"/>
-          <w:sz w:val="24"/>
-          <w:szCs w:val="24"/>
-        </w:rPr>
-        <w:t xml:space="preserve">NÃO apresentei Declaração de Ajuste Anual do Imposto de Renda Pessoa Física (DIRPF) à Receita Federal do Brasil referente aos exercícios de 2024, 2025 e 2026 (anos-calendário 2023, 2024 e 2025), por não me enquadrar em nenhuma das hipóteses de obrigatoriedade previstas na legislação tributária vigente;</w:t>
-      </w:r>
-    </w:p>
-    <w:p>
-      <w:pPr>
-        <w:spacing w:after="200" w:line="360"/>
+          <w:sz w:val="24"/>
+          <w:szCs w:val="24"/>
+        </w:rPr>
+        <w:t xml:space="preserve">Esta declaração está em conformidade com a IN RFB nº 2172, de 9 de janeiro de 2024 e a Lei nº 7.115/83*.</w:t>
+      </w:r>
+    </w:p>
+    <w:p>
+      <w:pPr>
+        <w:spacing w:after="300" w:line="360" w:lineRule="auto"/>
         <w:ind w:firstLine="720"/>
         <w:jc w:val="both"/>
       </w:pPr>
       <w:r>
         <w:rPr>
           <w:rFonts w:ascii="Arial" w:cs="Arial" w:eastAsia="Arial" w:hAnsi="Arial"/>
-          <w:b/>
-          <w:bCs/>
-          <w:sz w:val="24"/>
-          <w:szCs w:val="24"/>
-        </w:rPr>
-        <w:t xml:space="preserve">II — </w:t>
-      </w:r>
-      <w:r>
-        <w:rPr>
-          <w:rFonts w:ascii="Arial" w:cs="Arial" w:eastAsia="Arial" w:hAnsi="Arial"/>
-          <w:sz w:val="24"/>
-          <w:szCs w:val="24"/>
-        </w:rPr>
-        <w:t xml:space="preserve">Meus rendimentos tributáveis não ultrapassaram o limite de isenção estabelecido pela Receita Federal do Brasil nos respectivos exercícios fiscais;</w:t>
-      </w:r>
-    </w:p>
-    <w:p>
-      <w:pPr>
-        <w:spacing w:after="200" w:line="360"/>
-        <w:ind w:firstLine="720"/>
-        <w:jc w:val="both"/>
-      </w:pPr>
-      <w:r>
-        <w:rPr>
-          <w:rFonts w:ascii="Arial" w:cs="Arial" w:eastAsia="Arial" w:hAnsi="Arial"/>
-          <w:b/>
-          <w:bCs/>
-          <w:sz w:val="24"/>
-          <w:szCs w:val="24"/>
-        </w:rPr>
-        <w:t xml:space="preserve">III — </w:t>
-      </w:r>
-      <w:r>
-        <w:rPr>
-          <w:rFonts w:ascii="Arial" w:cs="Arial" w:eastAsia="Arial" w:hAnsi="Arial"/>
-          <w:sz w:val="24"/>
-          <w:szCs w:val="24"/>
-        </w:rPr>
-        <w:t xml:space="preserve">Não possuo bens ou direitos, inclusive terra nua, de valor total superior ao limite estabelecido pela legislação vigente;</w:t>
-      </w:r>
-    </w:p>
-    <w:p>
-      <w:pPr>
-        <w:spacing w:after="200" w:line="360"/>
-        <w:ind w:firstLine="720"/>
-        <w:jc w:val="both"/>
-      </w:pPr>
-      <w:r>
-        <w:rPr>
-          <w:rFonts w:ascii="Arial" w:cs="Arial" w:eastAsia="Arial" w:hAnsi="Arial"/>
-          <w:b/>
-          <w:bCs/>
-          <w:sz w:val="24"/>
-          <w:szCs w:val="24"/>
-        </w:rPr>
-        <w:t xml:space="preserve">IV — </w:t>
-      </w:r>
-      <w:r>
-        <w:rPr>
-          <w:rFonts w:ascii="Arial" w:cs="Arial" w:eastAsia="Arial" w:hAnsi="Arial"/>
-          <w:sz w:val="24"/>
-          <w:szCs w:val="24"/>
-        </w:rPr>
-        <w:t xml:space="preserve">Não me enquadro em qualquer outra hipótese de obrigatoriedade de entrega da declaração, conforme a Instrução Normativa da Receita Federal vigente para cada exercício.</w:t>
-      </w:r>
-    </w:p>
-    <w:p>
-      <w:pPr>
-        <w:spacing w:after="200"/>
-      </w:pPr>
-    </w:p>
-    <w:p>
-      <w:pPr>
-        <w:spacing w:after="300" w:line="360"/>
-        <w:ind w:firstLine="720"/>
-        <w:jc w:val="both"/>
-      </w:pPr>
-      <w:r>
-        <w:rPr>
-          <w:rFonts w:ascii="Arial" w:cs="Arial" w:eastAsia="Arial" w:hAnsi="Arial"/>
-          <w:sz w:val="24"/>
-          <w:szCs w:val="24"/>
-        </w:rPr>
-        <w:t xml:space="preserve">Declaro estar ciente de que a falsidade das informações acima configura crime previsto no art. 299 do Código Penal (falsidade ideológica), sujeitando-me às sanções penais cabíveis, além de responsabilidade civil e administrativa.</w:t>
-      </w:r>
-    </w:p>
-    <w:p>
-      <w:pPr>
-        <w:spacing w:after="400" w:line="360"/>
-        <w:ind w:firstLine="720"/>
-        <w:jc w:val="both"/>
-      </w:pPr>
-      <w:r>
-        <w:rPr>
-          <w:rFonts w:ascii="Arial" w:cs="Arial" w:eastAsia="Arial" w:hAnsi="Arial"/>
-          <w:sz w:val="24"/>
-          <w:szCs w:val="24"/>
-        </w:rPr>
-        <w:t xml:space="preserve">A presente declaração é firmada em atendimento ao despacho judicial proferido nos autos do processo acima referido, devendo ser acompanhada do respectivo comprovante emitido pela Receita Federal do Brasil que ateste a inexistência de declarações na base de dados do órgão.</w:t>
+          <w:sz w:val="24"/>
+          <w:szCs w:val="24"/>
+        </w:rPr>
+        <w:t xml:space="preserve">Declaro ainda, sob as penas da lei, serem verdadeiras todas as informações acima prestadas.</w:t>
       </w:r>
     </w:p>
     <w:p>
@@ -230,25 +305,21 @@
     </w:p>
     <w:p>
       <w:pPr>
-        <w:spacing w:after="600"/>
-      </w:pPr>
-    </w:p>
-    <w:p>
-      <w:pPr>
-        <w:pBdr>
-          <w:top w:val="single" w:sz="1" w:space="1"/>
-        </w:pBdr>
+        <w:spacing w:after="400"/>
+      </w:pPr>
+    </w:p>
+    <w:p>
+      <w:pPr>
         <w:spacing w:after="0"/>
         <w:jc w:val="center"/>
       </w:pPr>
       <w:r>
         <w:rPr>
           <w:rFonts w:ascii="Arial" w:cs="Arial" w:eastAsia="Arial" w:hAnsi="Arial"/>
-          <w:color w:val="FFFFFF"/>
-          <w:sz w:val="24"/>
-          <w:szCs w:val="24"/>
-        </w:rPr>
-        <w:t xml:space="preserve">_______________________________________________</w:t>
+          <w:sz w:val="24"/>
+          <w:szCs w:val="24"/>
+        </w:rPr>
+        <w:t xml:space="preserve">________________________________________</w:t>
       </w:r>
     </w:p>
     <w:p>
@@ -262,51 +333,245 @@
           <w:sz w:val="24"/>
           <w:szCs w:val="24"/>
         </w:rPr>
-        <w:t xml:space="preserve">________________________________________</w:t>
-      </w:r>
-    </w:p>
-    <w:p>
-      <w:pPr>
-        <w:spacing w:after="0"/>
-        <w:jc w:val="center"/>
-      </w:pPr>
-      <w:r>
-        <w:rPr>
-          <w:rFonts w:ascii="Arial" w:cs="Arial" w:eastAsia="Arial" w:hAnsi="Arial"/>
-          <w:b/>
-          <w:bCs/>
-          <w:sz w:val="24"/>
-          <w:szCs w:val="24"/>
-        </w:rPr>
-        <w:t xml:space="preserve">VINICIUS HENRIQUE DE SOUZA SANTANA</w:t>
-      </w:r>
-    </w:p>
-    <w:p>
-      <w:pPr>
-        <w:spacing w:after="0"/>
-        <w:jc w:val="center"/>
-      </w:pPr>
-      <w:r>
-        <w:rPr>
-          <w:rFonts w:ascii="Arial" w:cs="Arial" w:eastAsia="Arial" w:hAnsi="Arial"/>
-          <w:sz w:val="22"/>
-          <w:szCs w:val="22"/>
-        </w:rPr>
-        <w:t xml:space="preserve">CPF: 513.587.828-90</w:t>
-      </w:r>
-    </w:p>
-    <w:p>
-      <w:pPr>
-        <w:spacing w:after="0"/>
-        <w:jc w:val="center"/>
-      </w:pPr>
-      <w:r>
-        <w:rPr>
-          <w:rFonts w:ascii="Arial" w:cs="Arial" w:eastAsia="Arial" w:hAnsi="Arial"/>
-          <w:sz w:val="22"/>
-          <w:szCs w:val="22"/>
-        </w:rPr>
-        <w:t xml:space="preserve">RG: 39.642.708-X SSP/SP</w:t>
+        <w:t xml:space="preserve">Assinatura</w:t>
+      </w:r>
+    </w:p>
+    <w:p>
+      <w:pPr>
+        <w:spacing w:after="600"/>
+      </w:pPr>
+    </w:p>
+    <w:p>
+      <w:pPr>
+        <w:spacing w:after="100"/>
+        <w:jc w:val="left"/>
+      </w:pPr>
+      <w:r>
+        <w:rPr>
+          <w:rFonts w:ascii="Arial" w:cs="Arial" w:eastAsia="Arial" w:hAnsi="Arial"/>
+          <w:sz w:val="20"/>
+          <w:szCs w:val="20"/>
+        </w:rPr>
+        <w:t xml:space="preserve">________________</w:t>
+      </w:r>
+    </w:p>
+    <w:p>
+      <w:pPr>
+        <w:spacing w:after="200" w:line="276" w:lineRule="auto"/>
+        <w:jc w:val="both"/>
+      </w:pPr>
+      <w:r>
+        <w:rPr>
+          <w:rFonts w:ascii="Arial" w:cs="Arial" w:eastAsia="Arial" w:hAnsi="Arial"/>
+          <w:b/>
+          <w:bCs/>
+          <w:sz w:val="20"/>
+          <w:szCs w:val="20"/>
+        </w:rPr>
+        <w:t xml:space="preserve">* </w:t>
+      </w:r>
+      <w:r>
+        <w:rPr>
+          <w:rFonts w:ascii="Arial" w:cs="Arial" w:eastAsia="Arial" w:hAnsi="Arial"/>
+          <w:sz w:val="20"/>
+          <w:szCs w:val="20"/>
+        </w:rPr>
+        <w:t xml:space="preserve">Esclarecemos que a Receita Federal do Brasil não emite declaração de que o(a) cidadão(ã) está isento(a) de apresentar a Declaração do Imposto de Renda da Pessoa Física (DIRPF), pois a Instrução Normativa RFB nº 2172, de 9 de janeiro de 2024 (que revogou a IN RFB nº 1548/2015), regula que, a partir do ano de 2008, deixa de existir a Declaração Anual de Isento. Ademais, a Lei nº 7.115/83 assegura que a isenção poderá ser comprovada mediante declaração escrita e assinada pelo próprio interessado.</w:t>
+      </w:r>
+    </w:p>
+    <w:p>
+      <w:pPr>
+        <w:spacing w:after="300"/>
+      </w:pPr>
+    </w:p>
+    <w:p>
+      <w:pPr>
+        <w:spacing w:after="100" w:line="276" w:lineRule="auto"/>
+        <w:jc w:val="left"/>
+      </w:pPr>
+      <w:r>
+        <w:rPr>
+          <w:rFonts w:ascii="Arial" w:cs="Arial" w:eastAsia="Arial" w:hAnsi="Arial"/>
+          <w:b/>
+          <w:bCs/>
+          <w:sz w:val="20"/>
+          <w:szCs w:val="20"/>
+        </w:rPr>
+        <w:t xml:space="preserve">LEI Nº 7.115, DE 29 DE AGOSTO DE 1983.</w:t>
+      </w:r>
+    </w:p>
+    <w:p>
+      <w:pPr>
+        <w:spacing w:after="100" w:line="276" w:lineRule="auto"/>
+        <w:jc w:val="left"/>
+      </w:pPr>
+      <w:r>
+        <w:rPr>
+          <w:rFonts w:ascii="Arial" w:cs="Arial" w:eastAsia="Arial" w:hAnsi="Arial"/>
+          <w:i/>
+          <w:iCs/>
+          <w:sz w:val="20"/>
+          <w:szCs w:val="20"/>
+        </w:rPr>
+        <w:t xml:space="preserve">Dispõe sobre prova documental nos casos que indica e dá outras providências.</w:t>
+      </w:r>
+    </w:p>
+    <w:p>
+      <w:pPr>
+        <w:spacing w:after="100" w:line="276" w:lineRule="auto"/>
+        <w:jc w:val="both"/>
+      </w:pPr>
+      <w:r>
+        <w:rPr>
+          <w:rFonts w:ascii="Arial" w:cs="Arial" w:eastAsia="Arial" w:hAnsi="Arial"/>
+          <w:sz w:val="20"/>
+          <w:szCs w:val="20"/>
+        </w:rPr>
+        <w:t xml:space="preserve">O PRESIDENTE DA REPÚBLICA, faço saber que o Congresso Nacional decreta e eu sanciono a seguinte Lei:</w:t>
+      </w:r>
+    </w:p>
+    <w:p>
+      <w:pPr>
+        <w:spacing w:after="100" w:line="276" w:lineRule="auto"/>
+        <w:jc w:val="both"/>
+      </w:pPr>
+      <w:r>
+        <w:rPr>
+          <w:rFonts w:ascii="Arial" w:cs="Arial" w:eastAsia="Arial" w:hAnsi="Arial"/>
+          <w:b/>
+          <w:bCs/>
+          <w:sz w:val="20"/>
+          <w:szCs w:val="20"/>
+        </w:rPr>
+        <w:t xml:space="preserve">Art. 1º</w:t>
+      </w:r>
+      <w:r>
+        <w:rPr>
+          <w:rFonts w:ascii="Arial" w:cs="Arial" w:eastAsia="Arial" w:hAnsi="Arial"/>
+          <w:sz w:val="20"/>
+          <w:szCs w:val="20"/>
+        </w:rPr>
+        <w:t xml:space="preserve"> - A declaração destinada a fazer prova de vida, residência, pobreza, dependência econômica, homonímia ou bons antecedentes, quando firmada pelo próprio interessado ou por procurador bastante, e sob as penas da Lei, presume-se verdadeira.</w:t>
+      </w:r>
+    </w:p>
+    <w:p>
+      <w:pPr>
+        <w:spacing w:after="100" w:line="276" w:lineRule="auto"/>
+        <w:jc w:val="both"/>
+      </w:pPr>
+      <w:r>
+        <w:rPr>
+          <w:rFonts w:ascii="Arial" w:cs="Arial" w:eastAsia="Arial" w:hAnsi="Arial"/>
+          <w:b/>
+          <w:bCs/>
+          <w:sz w:val="20"/>
+          <w:szCs w:val="20"/>
+        </w:rPr>
+        <w:t xml:space="preserve">Parágrafo único</w:t>
+      </w:r>
+      <w:r>
+        <w:rPr>
+          <w:rFonts w:ascii="Arial" w:cs="Arial" w:eastAsia="Arial" w:hAnsi="Arial"/>
+          <w:sz w:val="20"/>
+          <w:szCs w:val="20"/>
+        </w:rPr>
+        <w:t xml:space="preserve"> - O dispositivo neste artigo não se aplica para fins de prova em processo penal.</w:t>
+      </w:r>
+    </w:p>
+    <w:p>
+      <w:pPr>
+        <w:spacing w:after="100" w:line="276" w:lineRule="auto"/>
+        <w:jc w:val="both"/>
+      </w:pPr>
+      <w:r>
+        <w:rPr>
+          <w:rFonts w:ascii="Arial" w:cs="Arial" w:eastAsia="Arial" w:hAnsi="Arial"/>
+          <w:b/>
+          <w:bCs/>
+          <w:sz w:val="20"/>
+          <w:szCs w:val="20"/>
+        </w:rPr>
+        <w:t xml:space="preserve">Art. 2º</w:t>
+      </w:r>
+      <w:r>
+        <w:rPr>
+          <w:rFonts w:ascii="Arial" w:cs="Arial" w:eastAsia="Arial" w:hAnsi="Arial"/>
+          <w:sz w:val="20"/>
+          <w:szCs w:val="20"/>
+        </w:rPr>
+        <w:t xml:space="preserve"> - Se comprovadamente falsa a declaração, sujeitar-se-á o declarante às sanções civis, administrativas e criminais previstas na legislação aplicável.</w:t>
+      </w:r>
+    </w:p>
+    <w:p>
+      <w:pPr>
+        <w:spacing w:after="100" w:line="276" w:lineRule="auto"/>
+        <w:jc w:val="both"/>
+      </w:pPr>
+      <w:r>
+        <w:rPr>
+          <w:rFonts w:ascii="Arial" w:cs="Arial" w:eastAsia="Arial" w:hAnsi="Arial"/>
+          <w:b/>
+          <w:bCs/>
+          <w:sz w:val="20"/>
+          <w:szCs w:val="20"/>
+        </w:rPr>
+        <w:t xml:space="preserve">Art. 3º</w:t>
+      </w:r>
+      <w:r>
+        <w:rPr>
+          <w:rFonts w:ascii="Arial" w:cs="Arial" w:eastAsia="Arial" w:hAnsi="Arial"/>
+          <w:sz w:val="20"/>
+          <w:szCs w:val="20"/>
+        </w:rPr>
+        <w:t xml:space="preserve"> - A declaração mencionará expressamente a responsabilidade do declarante.</w:t>
+      </w:r>
+    </w:p>
+    <w:p>
+      <w:pPr>
+        <w:spacing w:after="100" w:line="276" w:lineRule="auto"/>
+        <w:jc w:val="both"/>
+      </w:pPr>
+      <w:r>
+        <w:rPr>
+          <w:rFonts w:ascii="Arial" w:cs="Arial" w:eastAsia="Arial" w:hAnsi="Arial"/>
+          <w:b/>
+          <w:bCs/>
+          <w:sz w:val="20"/>
+          <w:szCs w:val="20"/>
+        </w:rPr>
+        <w:t xml:space="preserve">Art. 4º</w:t>
+      </w:r>
+      <w:r>
+        <w:rPr>
+          <w:rFonts w:ascii="Arial" w:cs="Arial" w:eastAsia="Arial" w:hAnsi="Arial"/>
+          <w:sz w:val="20"/>
+          <w:szCs w:val="20"/>
+        </w:rPr>
+        <w:t xml:space="preserve"> - Esta Lei entra em vigor na data de sua publicação.</w:t>
+      </w:r>
+    </w:p>
+    <w:p>
+      <w:pPr>
+        <w:spacing w:after="100" w:line="276" w:lineRule="auto"/>
+        <w:jc w:val="both"/>
+      </w:pPr>
+      <w:r>
+        <w:rPr>
+          <w:rFonts w:ascii="Arial" w:cs="Arial" w:eastAsia="Arial" w:hAnsi="Arial"/>
+          <w:b/>
+          <w:bCs/>
+          <w:sz w:val="20"/>
+          <w:szCs w:val="20"/>
+        </w:rPr>
+        <w:t xml:space="preserve">Art. 5º</w:t>
+      </w:r>
+      <w:r>
+        <w:rPr>
+          <w:rFonts w:ascii="Arial" w:cs="Arial" w:eastAsia="Arial" w:hAnsi="Arial"/>
+          <w:sz w:val="20"/>
+          <w:szCs w:val="20"/>
+        </w:rPr>
+        <w:t xml:space="preserve"> - Revogam-se as disposições em contrário.</w:t>
       </w:r>
     </w:p>
     <w:sectPr>

</xml_diff>

<commit_message>
Update IR exemption declaration: add date (06/10/2026) and signatory name
Co-Authored-By: Claude Opus 4.6 <noreply@anthropic.com>
Claude-Session: https://claude.ai/code/session_017AwowK1WNMoXShPKi68xcJ
</commit_message>
<xml_diff>
--- a/Declaracao_Isencao_IR_Vinicius_Santana.docx
+++ b/Declaracao_Isencao_IR_Vinicius_Santana.docx
@@ -300,7 +300,7 @@
           <w:sz w:val="24"/>
           <w:szCs w:val="24"/>
         </w:rPr>
-        <w:t xml:space="preserve">São Paulo, ______ de __________________ de 2026.</w:t>
+        <w:t xml:space="preserve">São Paulo, 06 de outubro de 2026.</w:t>
       </w:r>
     </w:p>
     <w:p>
@@ -330,10 +330,12 @@
       <w:r>
         <w:rPr>
           <w:rFonts w:ascii="Arial" w:cs="Arial" w:eastAsia="Arial" w:hAnsi="Arial"/>
-          <w:sz w:val="24"/>
-          <w:szCs w:val="24"/>
-        </w:rPr>
-        <w:t xml:space="preserve">Assinatura</w:t>
+          <w:b/>
+          <w:bCs/>
+          <w:sz w:val="24"/>
+          <w:szCs w:val="24"/>
+        </w:rPr>
+        <w:t xml:space="preserve">VINICIUS HENRIQUE DE SOUZA SANTANA</w:t>
       </w:r>
     </w:p>
     <w:p>

</xml_diff>